<commit_message>
Simulation P1 et P2
</commit_message>
<xml_diff>
--- a/Sujet.docx
+++ b/Sujet.docx
@@ -1876,6 +1876,129 @@
         </w:rPr>
         <w:t xml:space="preserve">jetons de </w:t>
       </w:r>
+      <w:r>
+        <w:rPr>
+          <w:rFonts w:ascii="Times New Roman" w:eastAsia="Times New Roman" w:hAnsi="Times New Roman" w:cs="Times New Roman"/>
+          <w:sz w:val="24"/>
+          <w:szCs w:val="24"/>
+          <w:lang w:eastAsia="fr-FR"/>
+        </w:rPr>
+        <w:t>P2</w:t>
+      </w:r>
+      <w:r>
+        <w:rPr>
+          <w:rFonts w:ascii="Times New Roman" w:eastAsia="Times New Roman" w:hAnsi="Times New Roman" w:cs="Times New Roman"/>
+          <w:sz w:val="24"/>
+          <w:szCs w:val="24"/>
+          <w:lang w:eastAsia="fr-FR"/>
+        </w:rPr>
+        <w:t xml:space="preserve"> (comme un arc pré-pondéré classique).</w:t>
+      </w:r>
+    </w:p>
+    <w:p>
+      <w:pPr>
+        <w:rPr>
+          <w:rFonts w:ascii="Times New Roman" w:eastAsia="Times New Roman" w:hAnsi="Times New Roman" w:cs="Times New Roman"/>
+          <w:sz w:val="24"/>
+          <w:szCs w:val="24"/>
+          <w:lang w:eastAsia="fr-FR"/>
+        </w:rPr>
+      </w:pPr>
+    </w:p>
+    <w:p>
+      <w:pPr>
+        <w:rPr>
+          <w:rFonts w:ascii="Times New Roman" w:eastAsia="Times New Roman" w:hAnsi="Times New Roman" w:cs="Times New Roman"/>
+          <w:b/>
+          <w:sz w:val="24"/>
+          <w:szCs w:val="24"/>
+          <w:u w:val="single"/>
+          <w:lang w:eastAsia="fr-FR"/>
+        </w:rPr>
+      </w:pPr>
+      <w:r>
+        <w:rPr>
+          <w:rFonts w:ascii="Times New Roman" w:eastAsia="Times New Roman" w:hAnsi="Times New Roman" w:cs="Times New Roman"/>
+          <w:b/>
+          <w:sz w:val="24"/>
+          <w:szCs w:val="24"/>
+          <w:u w:val="single"/>
+          <w:lang w:eastAsia="fr-FR"/>
+        </w:rPr>
+        <w:t>Fonctionnement du projet :</w:t>
+      </w:r>
+    </w:p>
+    <w:p>
+      <w:pPr>
+        <w:pStyle w:val="Paragraphedeliste"/>
+        <w:numPr>
+          <w:ilvl w:val="0"/>
+          <w:numId w:val="3"/>
+        </w:numPr>
+        <w:rPr>
+          <w:rFonts w:ascii="Times New Roman" w:eastAsia="Times New Roman" w:hAnsi="Times New Roman" w:cs="Times New Roman"/>
+          <w:sz w:val="24"/>
+          <w:szCs w:val="24"/>
+          <w:lang w:eastAsia="fr-FR"/>
+        </w:rPr>
+      </w:pPr>
+      <w:r>
+        <w:rPr>
+          <w:rFonts w:ascii="Times New Roman" w:eastAsia="Times New Roman" w:hAnsi="Times New Roman" w:cs="Times New Roman"/>
+          <w:sz w:val="24"/>
+          <w:szCs w:val="24"/>
+          <w:lang w:eastAsia="fr-FR"/>
+        </w:rPr>
+        <w:t>T1 (arrivée de paquet)</w:t>
+      </w:r>
+    </w:p>
+    <w:p>
+      <w:pPr>
+        <w:pStyle w:val="Paragraphedeliste"/>
+        <w:numPr>
+          <w:ilvl w:val="0"/>
+          <w:numId w:val="3"/>
+        </w:numPr>
+        <w:rPr>
+          <w:rFonts w:ascii="Times New Roman" w:eastAsia="Times New Roman" w:hAnsi="Times New Roman" w:cs="Times New Roman"/>
+          <w:sz w:val="24"/>
+          <w:szCs w:val="24"/>
+          <w:lang w:eastAsia="fr-FR"/>
+        </w:rPr>
+      </w:pPr>
+      <w:r>
+        <w:rPr>
+          <w:rFonts w:ascii="Times New Roman" w:eastAsia="Times New Roman" w:hAnsi="Times New Roman" w:cs="Times New Roman"/>
+          <w:sz w:val="24"/>
+          <w:szCs w:val="24"/>
+          <w:lang w:eastAsia="fr-FR"/>
+        </w:rPr>
+        <w:t>T2 (traitement)</w:t>
+      </w:r>
+    </w:p>
+    <w:p>
+      <w:pPr>
+        <w:pStyle w:val="Paragraphedeliste"/>
+        <w:numPr>
+          <w:ilvl w:val="0"/>
+          <w:numId w:val="3"/>
+        </w:numPr>
+        <w:rPr>
+          <w:rFonts w:ascii="Times New Roman" w:eastAsia="Times New Roman" w:hAnsi="Times New Roman" w:cs="Times New Roman"/>
+          <w:sz w:val="24"/>
+          <w:szCs w:val="24"/>
+          <w:lang w:eastAsia="fr-FR"/>
+        </w:rPr>
+      </w:pPr>
+      <w:r>
+        <w:rPr>
+          <w:rFonts w:ascii="Times New Roman" w:eastAsia="Times New Roman" w:hAnsi="Times New Roman" w:cs="Times New Roman"/>
+          <w:sz w:val="24"/>
+          <w:szCs w:val="24"/>
+          <w:lang w:eastAsia="fr-FR"/>
+        </w:rPr>
+        <w:t>Rafale DDoS</w:t>
+      </w:r>
       <w:bookmarkStart w:id="0" w:name="_GoBack"/>
       <w:bookmarkEnd w:id="0"/>
       <w:r>
@@ -1885,16 +2008,7 @@
           <w:szCs w:val="24"/>
           <w:lang w:eastAsia="fr-FR"/>
         </w:rPr>
-        <w:t>P2</w:t>
-      </w:r>
-      <w:r>
-        <w:rPr>
-          <w:rFonts w:ascii="Times New Roman" w:eastAsia="Times New Roman" w:hAnsi="Times New Roman" w:cs="Times New Roman"/>
-          <w:sz w:val="24"/>
-          <w:szCs w:val="24"/>
-          <w:lang w:eastAsia="fr-FR"/>
-        </w:rPr>
-        <w:t xml:space="preserve"> (comme un arc pré-pondéré classique).</w:t>
+        <w:t xml:space="preserve"> les 6 jetons restants dans P2 sont normaux : x15 paquets envoyés, T3 se déclenche à K=10 (consomme 10 jetons), il reste 5, T2 en a traité quelques-uns entre temps, cohérent</w:t>
       </w:r>
     </w:p>
     <w:p/>
@@ -2172,11 +2286,126 @@
       </w:pPr>
     </w:lvl>
   </w:abstractNum>
+  <w:abstractNum w:abstractNumId="2" w15:restartNumberingAfterBreak="0">
+    <w:nsid w:val="6FC95080"/>
+    <w:multiLevelType w:val="hybridMultilevel"/>
+    <w:tmpl w:val="D862CDCE"/>
+    <w:lvl w:ilvl="0" w:tplc="ADCE23D4">
+      <w:numFmt w:val="bullet"/>
+      <w:lvlText w:val="-"/>
+      <w:lvlJc w:val="left"/>
+      <w:pPr>
+        <w:ind w:left="720" w:hanging="360"/>
+      </w:pPr>
+      <w:rPr>
+        <w:rFonts w:ascii="Times New Roman" w:eastAsia="Times New Roman" w:hAnsi="Times New Roman" w:cs="Times New Roman" w:hint="default"/>
+      </w:rPr>
+    </w:lvl>
+    <w:lvl w:ilvl="1" w:tplc="040C0003" w:tentative="1">
+      <w:start w:val="1"/>
+      <w:numFmt w:val="bullet"/>
+      <w:lvlText w:val="o"/>
+      <w:lvlJc w:val="left"/>
+      <w:pPr>
+        <w:ind w:left="1440" w:hanging="360"/>
+      </w:pPr>
+      <w:rPr>
+        <w:rFonts w:ascii="Courier New" w:hAnsi="Courier New" w:cs="Courier New" w:hint="default"/>
+      </w:rPr>
+    </w:lvl>
+    <w:lvl w:ilvl="2" w:tplc="040C0005" w:tentative="1">
+      <w:start w:val="1"/>
+      <w:numFmt w:val="bullet"/>
+      <w:lvlText w:val=""/>
+      <w:lvlJc w:val="left"/>
+      <w:pPr>
+        <w:ind w:left="2160" w:hanging="360"/>
+      </w:pPr>
+      <w:rPr>
+        <w:rFonts w:ascii="Wingdings" w:hAnsi="Wingdings" w:hint="default"/>
+      </w:rPr>
+    </w:lvl>
+    <w:lvl w:ilvl="3" w:tplc="040C0001" w:tentative="1">
+      <w:start w:val="1"/>
+      <w:numFmt w:val="bullet"/>
+      <w:lvlText w:val=""/>
+      <w:lvlJc w:val="left"/>
+      <w:pPr>
+        <w:ind w:left="2880" w:hanging="360"/>
+      </w:pPr>
+      <w:rPr>
+        <w:rFonts w:ascii="Symbol" w:hAnsi="Symbol" w:hint="default"/>
+      </w:rPr>
+    </w:lvl>
+    <w:lvl w:ilvl="4" w:tplc="040C0003" w:tentative="1">
+      <w:start w:val="1"/>
+      <w:numFmt w:val="bullet"/>
+      <w:lvlText w:val="o"/>
+      <w:lvlJc w:val="left"/>
+      <w:pPr>
+        <w:ind w:left="3600" w:hanging="360"/>
+      </w:pPr>
+      <w:rPr>
+        <w:rFonts w:ascii="Courier New" w:hAnsi="Courier New" w:cs="Courier New" w:hint="default"/>
+      </w:rPr>
+    </w:lvl>
+    <w:lvl w:ilvl="5" w:tplc="040C0005" w:tentative="1">
+      <w:start w:val="1"/>
+      <w:numFmt w:val="bullet"/>
+      <w:lvlText w:val=""/>
+      <w:lvlJc w:val="left"/>
+      <w:pPr>
+        <w:ind w:left="4320" w:hanging="360"/>
+      </w:pPr>
+      <w:rPr>
+        <w:rFonts w:ascii="Wingdings" w:hAnsi="Wingdings" w:hint="default"/>
+      </w:rPr>
+    </w:lvl>
+    <w:lvl w:ilvl="6" w:tplc="040C0001" w:tentative="1">
+      <w:start w:val="1"/>
+      <w:numFmt w:val="bullet"/>
+      <w:lvlText w:val=""/>
+      <w:lvlJc w:val="left"/>
+      <w:pPr>
+        <w:ind w:left="5040" w:hanging="360"/>
+      </w:pPr>
+      <w:rPr>
+        <w:rFonts w:ascii="Symbol" w:hAnsi="Symbol" w:hint="default"/>
+      </w:rPr>
+    </w:lvl>
+    <w:lvl w:ilvl="7" w:tplc="040C0003" w:tentative="1">
+      <w:start w:val="1"/>
+      <w:numFmt w:val="bullet"/>
+      <w:lvlText w:val="o"/>
+      <w:lvlJc w:val="left"/>
+      <w:pPr>
+        <w:ind w:left="5760" w:hanging="360"/>
+      </w:pPr>
+      <w:rPr>
+        <w:rFonts w:ascii="Courier New" w:hAnsi="Courier New" w:cs="Courier New" w:hint="default"/>
+      </w:rPr>
+    </w:lvl>
+    <w:lvl w:ilvl="8" w:tplc="040C0005" w:tentative="1">
+      <w:start w:val="1"/>
+      <w:numFmt w:val="bullet"/>
+      <w:lvlText w:val=""/>
+      <w:lvlJc w:val="left"/>
+      <w:pPr>
+        <w:ind w:left="6480" w:hanging="360"/>
+      </w:pPr>
+      <w:rPr>
+        <w:rFonts w:ascii="Wingdings" w:hAnsi="Wingdings" w:hint="default"/>
+      </w:rPr>
+    </w:lvl>
+  </w:abstractNum>
   <w:num w:numId="1">
     <w:abstractNumId w:val="0"/>
   </w:num>
   <w:num w:numId="2">
     <w:abstractNumId w:val="1"/>
+  </w:num>
+  <w:num w:numId="3">
+    <w:abstractNumId w:val="2"/>
   </w:num>
 </w:numbering>
 </file>
@@ -2607,6 +2836,17 @@
     <w:basedOn w:val="Policepardfaut"/>
     <w:rsid w:val="009D78F1"/>
   </w:style>
+  <w:style w:type="paragraph" w:styleId="Paragraphedeliste">
+    <w:name w:val="List Paragraph"/>
+    <w:basedOn w:val="Normal"/>
+    <w:uiPriority w:val="34"/>
+    <w:qFormat/>
+    <w:rsid w:val="0031574F"/>
+    <w:pPr>
+      <w:ind w:left="720"/>
+      <w:contextualSpacing/>
+    </w:pPr>
+  </w:style>
 </w:styles>
 </file>
 

</xml_diff>